<commit_message>
docs: replace auto-TOC field with static table of contents in Word document
</commit_message>
<xml_diff>
--- a/Projekt_esp32-link_Michalcewicz_Pawel_ver_01.docx
+++ b/Projekt_esp32-link_Michalcewicz_Pawel_ver_01.docx
@@ -275,12 +275,353 @@
       </w:r>
     </w:p>
     <w:p>
+      <w:pPr>
+        <w:ind w:left="0"/>
+      </w:pPr>
       <w:r>
-        <w:fldChar w:fldCharType="begin"/>
-        <w:instrText xml:space="preserve">TOC \o "1-3" \h \z \u</w:instrText>
-        <w:fldChar w:fldCharType="separate"/>
-        <w:t>Naciśnij F9 w programie Word, aby zaktualizować spis treści.</w:t>
-        <w:fldChar w:fldCharType="end"/>
+        <w:rPr>
+          <w:b/>
+        </w:rPr>
+        <w:t>Lista oznaczeń i skrótów</w:t>
+      </w:r>
+    </w:p>
+    <w:p>
+      <w:pPr>
+        <w:ind w:left="0"/>
+      </w:pPr>
+      <w:r>
+        <w:rPr>
+          <w:b/>
+        </w:rPr>
+        <w:t>1. Wstęp</w:t>
+      </w:r>
+    </w:p>
+    <w:p>
+      <w:pPr>
+        <w:ind w:left="0"/>
+      </w:pPr>
+      <w:r>
+        <w:rPr>
+          <w:b/>
+        </w:rPr>
+        <w:t>2. Funkcjonalność (functionality)</w:t>
+      </w:r>
+    </w:p>
+    <w:p>
+      <w:pPr>
+        <w:ind w:left="283"/>
+      </w:pPr>
+      <w:r>
+        <w:t>2.1 Mikrokontroler (firmware)</w:t>
+      </w:r>
+    </w:p>
+    <w:p>
+      <w:pPr>
+        <w:ind w:left="283"/>
+      </w:pPr>
+      <w:r>
+        <w:t>2.2 Aplikacja desktopowa</w:t>
+      </w:r>
+    </w:p>
+    <w:p>
+      <w:pPr>
+        <w:ind w:left="0"/>
+      </w:pPr>
+      <w:r>
+        <w:rPr>
+          <w:b/>
+        </w:rPr>
+        <w:t>3. Analiza problemu (problem analysis)</w:t>
+      </w:r>
+    </w:p>
+    <w:p>
+      <w:pPr>
+        <w:ind w:left="283"/>
+      </w:pPr>
+      <w:r>
+        <w:t>3.1 Współistnienie pętli zdarzeń Qt i asyncio</w:t>
+      </w:r>
+    </w:p>
+    <w:p>
+      <w:pPr>
+        <w:ind w:left="283"/>
+      </w:pPr>
+      <w:r>
+        <w:t>3.2 Reakcja wielu widgetów na te same zdarzenia</w:t>
+      </w:r>
+    </w:p>
+    <w:p>
+      <w:pPr>
+        <w:ind w:left="283"/>
+      </w:pPr>
+      <w:r>
+        <w:t>3.3 Reprezentacja stanu połączenia</w:t>
+      </w:r>
+    </w:p>
+    <w:p>
+      <w:pPr>
+        <w:ind w:left="283"/>
+      </w:pPr>
+      <w:r>
+        <w:t>3.4 Wymienność warstwy transportu</w:t>
+      </w:r>
+    </w:p>
+    <w:p>
+      <w:pPr>
+        <w:ind w:left="0"/>
+      </w:pPr>
+      <w:r>
+        <w:rPr>
+          <w:b/>
+        </w:rPr>
+        <w:t>4. Projekt techniczny (technical design)</w:t>
+      </w:r>
+    </w:p>
+    <w:p>
+      <w:pPr>
+        <w:ind w:left="283"/>
+      </w:pPr>
+      <w:r>
+        <w:t>4.1 Architektura warstwowa</w:t>
+      </w:r>
+    </w:p>
+    <w:p>
+      <w:pPr>
+        <w:ind w:left="283"/>
+      </w:pPr>
+      <w:r>
+        <w:t>4.2 Diagramy UML</w:t>
+      </w:r>
+    </w:p>
+    <w:p>
+      <w:pPr>
+        <w:ind w:left="283"/>
+      </w:pPr>
+      <w:r>
+        <w:t>4.3 Zastosowane wzorce projektowe</w:t>
+      </w:r>
+    </w:p>
+    <w:p>
+      <w:pPr>
+        <w:ind w:left="567"/>
+      </w:pPr>
+      <w:r>
+        <w:t>4.3.1 Facade — Esp32Client</w:t>
+      </w:r>
+    </w:p>
+    <w:p>
+      <w:pPr>
+        <w:ind w:left="567"/>
+      </w:pPr>
+      <w:r>
+        <w:t>4.3.2 Strategy — Transport</w:t>
+      </w:r>
+    </w:p>
+    <w:p>
+      <w:pPr>
+        <w:ind w:left="567"/>
+      </w:pPr>
+      <w:r>
+        <w:t>4.3.3 State — ConnectionStateMachine</w:t>
+      </w:r>
+    </w:p>
+    <w:p>
+      <w:pPr>
+        <w:ind w:left="567"/>
+      </w:pPr>
+      <w:r>
+        <w:t>4.3.4 Command — ToggleLedCommand, PingCommand</w:t>
+      </w:r>
+    </w:p>
+    <w:p>
+      <w:pPr>
+        <w:ind w:left="567"/>
+      </w:pPr>
+      <w:r>
+        <w:t>4.3.5 Observer — sygnały Qt klienta</w:t>
+      </w:r>
+    </w:p>
+    <w:p>
+      <w:pPr>
+        <w:ind w:left="567"/>
+      </w:pPr>
+      <w:r>
+        <w:t>4.3.6 Singleton — Config.instance()</w:t>
+      </w:r>
+    </w:p>
+    <w:p>
+      <w:pPr>
+        <w:ind w:left="0"/>
+      </w:pPr>
+      <w:r>
+        <w:rPr>
+          <w:b/>
+        </w:rPr>
+        <w:t>5. Opis realizacji (implementation report)</w:t>
+      </w:r>
+    </w:p>
+    <w:p>
+      <w:pPr>
+        <w:ind w:left="283"/>
+      </w:pPr>
+      <w:r>
+        <w:t>5.1 Protokół komunikacyjny</w:t>
+      </w:r>
+    </w:p>
+    <w:p>
+      <w:pPr>
+        <w:ind w:left="283"/>
+      </w:pPr>
+      <w:r>
+        <w:t>5.2 Maszyna stanów połączenia</w:t>
+      </w:r>
+    </w:p>
+    <w:p>
+      <w:pPr>
+        <w:ind w:left="283"/>
+      </w:pPr>
+      <w:r>
+        <w:t>5.3 Stałe sieciowe</w:t>
+      </w:r>
+    </w:p>
+    <w:p>
+      <w:pPr>
+        <w:ind w:left="283"/>
+      </w:pPr>
+      <w:r>
+        <w:t>5.4 Komentowanie kodu</w:t>
+      </w:r>
+    </w:p>
+    <w:p>
+      <w:pPr>
+        <w:ind w:left="0"/>
+      </w:pPr>
+      <w:r>
+        <w:rPr>
+          <w:b/>
+        </w:rPr>
+        <w:t>6. Opis wykonanych testów (testing report)</w:t>
+      </w:r>
+    </w:p>
+    <w:p>
+      <w:pPr>
+        <w:ind w:left="283"/>
+      </w:pPr>
+      <w:r>
+        <w:t>6.1 Strategia testowania</w:t>
+      </w:r>
+    </w:p>
+    <w:p>
+      <w:pPr>
+        <w:ind w:left="283"/>
+      </w:pPr>
+      <w:r>
+        <w:t>6.2 Continuous Integration</w:t>
+      </w:r>
+    </w:p>
+    <w:p>
+      <w:pPr>
+        <w:ind w:left="283"/>
+      </w:pPr>
+      <w:r>
+        <w:t>6.3 Lista znalezionych i naprawionych błędów</w:t>
+      </w:r>
+    </w:p>
+    <w:p>
+      <w:pPr>
+        <w:ind w:left="0"/>
+      </w:pPr>
+      <w:r>
+        <w:rPr>
+          <w:b/>
+        </w:rPr>
+        <w:t>7. Podręcznik użytkownika (user's manual)</w:t>
+      </w:r>
+    </w:p>
+    <w:p>
+      <w:pPr>
+        <w:ind w:left="283"/>
+      </w:pPr>
+      <w:r>
+        <w:t>7.1 Wymagania sprzętowe</w:t>
+      </w:r>
+    </w:p>
+    <w:p>
+      <w:pPr>
+        <w:ind w:left="283"/>
+      </w:pPr>
+      <w:r>
+        <w:t>7.2 Wymagania programowe</w:t>
+      </w:r>
+    </w:p>
+    <w:p>
+      <w:pPr>
+        <w:ind w:left="283"/>
+      </w:pPr>
+      <w:r>
+        <w:t>7.3 Uruchomienie pierwsze (runbook)</w:t>
+      </w:r>
+    </w:p>
+    <w:p>
+      <w:pPr>
+        <w:ind w:left="283"/>
+      </w:pPr>
+      <w:r>
+        <w:t>7.4 Diagnostyka problemów</w:t>
+      </w:r>
+    </w:p>
+    <w:p>
+      <w:pPr>
+        <w:ind w:left="0"/>
+      </w:pPr>
+      <w:r>
+        <w:rPr>
+          <w:b/>
+        </w:rPr>
+        <w:t>8. Metodologia rozwoju i utrzymania systemu</w:t>
+      </w:r>
+    </w:p>
+    <w:p>
+      <w:pPr>
+        <w:ind w:left="283"/>
+      </w:pPr>
+      <w:r>
+        <w:t>8.1 Kontrola wersji</w:t>
+      </w:r>
+    </w:p>
+    <w:p>
+      <w:pPr>
+        <w:ind w:left="283"/>
+      </w:pPr>
+      <w:r>
+        <w:t>8.2 Automatyzacja jakości</w:t>
+      </w:r>
+    </w:p>
+    <w:p>
+      <w:pPr>
+        <w:ind w:left="283"/>
+      </w:pPr>
+      <w:r>
+        <w:t>8.3 Strategia ponownych prób połączenia</w:t>
+      </w:r>
+    </w:p>
+    <w:p>
+      <w:pPr>
+        <w:ind w:left="283"/>
+      </w:pPr>
+      <w:r>
+        <w:t>8.4 Procedura dodawania nowego polecenia</w:t>
+      </w:r>
+    </w:p>
+    <w:p>
+      <w:pPr>
+        <w:ind w:left="0"/>
+      </w:pPr>
+      <w:r>
+        <w:rPr>
+          <w:b/>
+        </w:rPr>
+        <w:t>Bibliografia</w:t>
       </w:r>
     </w:p>
     <w:p>

</xml_diff>